<commit_message>
poprawione scenraiusze i diagram przypadkow uzycia
</commit_message>
<xml_diff>
--- a/scenariusze/Dodaj material.docx
+++ b/scenariusze/Dodaj material.docx
@@ -1,52 +1,29 @@
 
 <file path=word/document.xml><?xml version="1.0" encoding="utf-8"?>
-<w:document xmlns:wpc="http://schemas.microsoft.com/office/word/2010/wordprocessingCanvas" xmlns:mc="http://schemas.openxmlformats.org/markup-compatibility/2006" xmlns:o="urn:schemas-microsoft-com:office:office" xmlns:r="http://schemas.openxmlformats.org/officeDocument/2006/relationships" xmlns:m="http://schemas.openxmlformats.org/officeDocument/2006/math" xmlns:v="urn:schemas-microsoft-com:vml" xmlns:wp14="http://schemas.microsoft.com/office/word/2010/wordprocessingDrawing" xmlns:wp="http://schemas.openxmlformats.org/drawingml/2006/wordprocessingDrawing" xmlns:w10="urn:schemas-microsoft-com:office:word" xmlns:w="http://schemas.openxmlformats.org/wordprocessingml/2006/main" xmlns:w14="http://schemas.microsoft.com/office/word/2010/wordml" xmlns:w15="http://schemas.microsoft.com/office/word/2012/wordml" xmlns:wpg="http://schemas.microsoft.com/office/word/2010/wordprocessingGroup" xmlns:wpi="http://schemas.microsoft.com/office/word/2010/wordprocessingInk" xmlns:wne="http://schemas.microsoft.com/office/word/2006/wordml" xmlns:wps="http://schemas.microsoft.com/office/word/2010/wordprocessingShape" xmlns:w16se="http://schemas.microsoft.com/office/word/2015/wordml/symex" xmlns:w16cid="http://schemas.microsoft.com/office/word/2016/wordml/cid" xmlns:w16="http://schemas.microsoft.com/office/word/2018/wordml" xmlns:w16cex="http://schemas.microsoft.com/office/word/2018/wordml/cex" xmlns:w16sdtdh="http://schemas.microsoft.com/office/word/2020/wordml/sdtdatahash" xmlns:w16sdtfl="http://schemas.microsoft.com/office/word/2024/wordml/sdtformatlock" mc:Ignorable="w14 w15 wp14 w16se w16cid w16 w16cex w16sdtdh w16sdtfl">
+<w:document xmlns:wpc="http://schemas.microsoft.com/office/word/2010/wordprocessingCanvas" xmlns:cx="http://schemas.microsoft.com/office/drawing/2014/chartex" xmlns:cx1="http://schemas.microsoft.com/office/drawing/2015/9/8/chartex" xmlns:cx2="http://schemas.microsoft.com/office/drawing/2015/10/21/chartex" xmlns:cx3="http://schemas.microsoft.com/office/drawing/2016/5/9/chartex" xmlns:cx4="http://schemas.microsoft.com/office/drawing/2016/5/10/chartex" xmlns:cx5="http://schemas.microsoft.com/office/drawing/2016/5/11/chartex" xmlns:cx6="http://schemas.microsoft.com/office/drawing/2016/5/12/chartex" xmlns:cx7="http://schemas.microsoft.com/office/drawing/2016/5/13/chartex" xmlns:cx8="http://schemas.microsoft.com/office/drawing/2016/5/14/chartex" xmlns:mc="http://schemas.openxmlformats.org/markup-compatibility/2006" xmlns:aink="http://schemas.microsoft.com/office/drawing/2016/ink" xmlns:am3d="http://schemas.microsoft.com/office/drawing/2017/model3d" xmlns:o="urn:schemas-microsoft-com:office:office" xmlns:oel="http://schemas.microsoft.com/office/2019/extlst" xmlns:r="http://schemas.openxmlformats.org/officeDocument/2006/relationships" xmlns:m="http://schemas.openxmlformats.org/officeDocument/2006/math" xmlns:v="urn:schemas-microsoft-com:vml" xmlns:wp14="http://schemas.microsoft.com/office/word/2010/wordprocessingDrawing" xmlns:wp="http://schemas.openxmlformats.org/drawingml/2006/wordprocessingDrawing" xmlns:w10="urn:schemas-microsoft-com:office:word" xmlns:w="http://schemas.openxmlformats.org/wordprocessingml/2006/main" xmlns:w14="http://schemas.microsoft.com/office/word/2010/wordml" xmlns:w15="http://schemas.microsoft.com/office/word/2012/wordml" xmlns:w16cex="http://schemas.microsoft.com/office/word/2018/wordml/cex" xmlns:w16cid="http://schemas.microsoft.com/office/word/2016/wordml/cid" xmlns:w16="http://schemas.microsoft.com/office/word/2018/wordml" xmlns:w16du="http://schemas.microsoft.com/office/word/2023/wordml/word16du" xmlns:w16sdtdh="http://schemas.microsoft.com/office/word/2020/wordml/sdtdatahash" xmlns:w16sdtfl="http://schemas.microsoft.com/office/word/2024/wordml/sdtformatlock" xmlns:w16se="http://schemas.microsoft.com/office/word/2015/wordml/symex" xmlns:wpg="http://schemas.microsoft.com/office/word/2010/wordprocessingGroup" xmlns:wpi="http://schemas.microsoft.com/office/word/2010/wordprocessingInk" xmlns:wne="http://schemas.microsoft.com/office/word/2006/wordml" xmlns:wps="http://schemas.microsoft.com/office/word/2010/wordprocessingShape" mc:Ignorable="w14 w15 w16se w16cid w16 w16cex w16sdtdh w16sdtfl w16du wp14">
   <w:body>
-    <w:p xmlns:wp14="http://schemas.microsoft.com/office/word/2010/wordml" wp14:paraId="410CC642" wp14:textId="423E8FF5">
+    <w:p>
       <w:pPr>
         <w:rPr>
-          <w:rFonts w:ascii="Aptos" w:hAnsi="Aptos" w:eastAsia="Aptos" w:cs="Aptos"/>
-          <w:b w:val="0"/>
-          <w:bCs w:val="0"/>
-          <w:i w:val="0"/>
-          <w:iCs w:val="0"/>
-          <w:noProof w:val="0"/>
-          <w:sz w:val="24"/>
-          <w:szCs w:val="24"/>
-          <w:lang w:val="pl-PL"/>
+          <w:rFonts w:ascii="Aptos" w:eastAsia="Aptos" w:hAnsi="Aptos" w:cs="Aptos"/>
         </w:rPr>
       </w:pPr>
-      <w:r>
-        <w:rPr>
-          <w:rFonts w:ascii="Aptos" w:hAnsi="Aptos" w:eastAsia="Aptos" w:cs="Aptos"/>
-          <w:b w:val="0"/>
-          <w:bCs w:val="0"/>
-          <w:i w:val="0"/>
-          <w:iCs w:val="0"/>
-          <w:noProof w:val="0"/>
-          <w:sz w:val="24"/>
-          <w:szCs w:val="24"/>
-          <w:lang w:val="pl-PL"/>
-        </w:rPr>
-        <w:t>Dodaj materiał</w:t>
-      </w:r>
     </w:p>
     <w:tbl>
       <w:tblPr>
-        <w:tblStyle w:val="TableGrid"/>
-        <w:bidiVisual w:val="0"/>
+        <w:tblStyle w:val="a3"/>
         <w:tblW w:w="0" w:type="auto"/>
         <w:tblBorders>
-          <w:top w:val="single" w:sz="6"/>
-          <w:left w:val="single" w:sz="6"/>
-          <w:bottom w:val="single" w:sz="6"/>
-          <w:right w:val="single" w:sz="6"/>
+          <w:top w:val="single" w:sz="6" w:space="0" w:color="auto"/>
+          <w:left w:val="single" w:sz="6" w:space="0" w:color="auto"/>
+          <w:bottom w:val="single" w:sz="6" w:space="0" w:color="auto"/>
+          <w:right w:val="single" w:sz="6" w:space="0" w:color="auto"/>
         </w:tblBorders>
         <w:tblLook w:val="06A0" w:firstRow="1" w:lastRow="0" w:firstColumn="1" w:lastColumn="0" w:noHBand="1" w:noVBand="1"/>
       </w:tblPr>
       <w:tblGrid>
-        <w:gridCol w:w="2190"/>
-        <w:gridCol w:w="6825"/>
+        <w:gridCol w:w="2189"/>
+        <w:gridCol w:w="6821"/>
       </w:tblGrid>
       <w:tr>
         <w:trPr>
@@ -54,36 +31,21 @@
         </w:trPr>
         <w:tc>
           <w:tcPr>
-            <w:tcW w:w="2190" w:type="dxa"/>
-            <w:tcMar>
-              <w:left w:w="105" w:type="dxa"/>
-              <w:right w:w="105" w:type="dxa"/>
-            </w:tcMar>
-            <w:vAlign w:val="top"/>
-          </w:tcPr>
-          <w:p>
-            <w:pPr>
-              <w:rPr>
-                <w:rFonts w:ascii="Aptos" w:hAnsi="Aptos" w:eastAsia="Aptos" w:cs="Aptos"/>
-                <w:b w:val="0"/>
-                <w:bCs w:val="0"/>
-                <w:i w:val="0"/>
-                <w:iCs w:val="0"/>
-                <w:sz w:val="24"/>
-                <w:szCs w:val="24"/>
-                <w:lang w:val="pl-PL"/>
-              </w:rPr>
-            </w:pPr>
-            <w:r>
-              <w:rPr>
-                <w:rFonts w:ascii="Aptos" w:hAnsi="Aptos" w:eastAsia="Aptos" w:cs="Aptos"/>
-                <w:b w:val="0"/>
-                <w:bCs w:val="0"/>
-                <w:i w:val="0"/>
-                <w:iCs w:val="0"/>
-                <w:sz w:val="24"/>
-                <w:szCs w:val="24"/>
-                <w:lang w:val="pl-PL"/>
+            <w:tcW w:w="2189" w:type="dxa"/>
+            <w:tcMar>
+              <w:left w:w="105" w:type="dxa"/>
+              <w:right w:w="105" w:type="dxa"/>
+            </w:tcMar>
+          </w:tcPr>
+          <w:p>
+            <w:pPr>
+              <w:rPr>
+                <w:rFonts w:ascii="Aptos" w:eastAsia="Aptos" w:hAnsi="Aptos" w:cs="Aptos"/>
+              </w:rPr>
+            </w:pPr>
+            <w:r>
+              <w:rPr>
+                <w:rFonts w:ascii="Aptos" w:eastAsia="Aptos" w:hAnsi="Aptos" w:cs="Aptos"/>
               </w:rPr>
               <w:t>Przypadek użycia</w:t>
             </w:r>
@@ -91,36 +53,21 @@
         </w:tc>
         <w:tc>
           <w:tcPr>
-            <w:tcW w:w="6825" w:type="dxa"/>
-            <w:tcMar>
-              <w:left w:w="105" w:type="dxa"/>
-              <w:right w:w="105" w:type="dxa"/>
-            </w:tcMar>
-            <w:vAlign w:val="top"/>
-          </w:tcPr>
-          <w:p>
-            <w:pPr>
-              <w:rPr>
-                <w:rFonts w:ascii="Aptos" w:hAnsi="Aptos" w:eastAsia="Aptos" w:cs="Aptos"/>
-                <w:b w:val="0"/>
-                <w:bCs w:val="0"/>
-                <w:i w:val="0"/>
-                <w:iCs w:val="0"/>
-                <w:sz w:val="24"/>
-                <w:szCs w:val="24"/>
-                <w:lang w:val="pl-PL"/>
-              </w:rPr>
-            </w:pPr>
-            <w:r>
-              <w:rPr>
-                <w:rFonts w:ascii="Aptos" w:hAnsi="Aptos" w:eastAsia="Aptos" w:cs="Aptos"/>
-                <w:b w:val="0"/>
-                <w:bCs w:val="0"/>
-                <w:i w:val="0"/>
-                <w:iCs w:val="0"/>
-                <w:sz w:val="24"/>
-                <w:szCs w:val="24"/>
-                <w:lang w:val="pl-PL"/>
+            <w:tcW w:w="6821" w:type="dxa"/>
+            <w:tcMar>
+              <w:left w:w="105" w:type="dxa"/>
+              <w:right w:w="105" w:type="dxa"/>
+            </w:tcMar>
+          </w:tcPr>
+          <w:p>
+            <w:pPr>
+              <w:rPr>
+                <w:rFonts w:ascii="Aptos" w:eastAsia="Aptos" w:hAnsi="Aptos" w:cs="Aptos"/>
+              </w:rPr>
+            </w:pPr>
+            <w:r>
+              <w:rPr>
+                <w:rFonts w:ascii="Aptos" w:eastAsia="Aptos" w:hAnsi="Aptos" w:cs="Aptos"/>
               </w:rPr>
               <w:t>Dodaj materiał</w:t>
             </w:r>
@@ -133,36 +80,21 @@
         </w:trPr>
         <w:tc>
           <w:tcPr>
-            <w:tcW w:w="2190" w:type="dxa"/>
-            <w:tcMar>
-              <w:left w:w="105" w:type="dxa"/>
-              <w:right w:w="105" w:type="dxa"/>
-            </w:tcMar>
-            <w:vAlign w:val="top"/>
-          </w:tcPr>
-          <w:p>
-            <w:pPr>
-              <w:rPr>
-                <w:rFonts w:ascii="Aptos" w:hAnsi="Aptos" w:eastAsia="Aptos" w:cs="Aptos"/>
-                <w:b w:val="0"/>
-                <w:bCs w:val="0"/>
-                <w:i w:val="0"/>
-                <w:iCs w:val="0"/>
-                <w:sz w:val="24"/>
-                <w:szCs w:val="24"/>
-                <w:lang w:val="pl-PL"/>
-              </w:rPr>
-            </w:pPr>
-            <w:r>
-              <w:rPr>
-                <w:rFonts w:ascii="Aptos" w:hAnsi="Aptos" w:eastAsia="Aptos" w:cs="Aptos"/>
-                <w:b w:val="0"/>
-                <w:bCs w:val="0"/>
-                <w:i w:val="0"/>
-                <w:iCs w:val="0"/>
-                <w:sz w:val="24"/>
-                <w:szCs w:val="24"/>
-                <w:lang w:val="pl-PL"/>
+            <w:tcW w:w="2189" w:type="dxa"/>
+            <w:tcMar>
+              <w:left w:w="105" w:type="dxa"/>
+              <w:right w:w="105" w:type="dxa"/>
+            </w:tcMar>
+          </w:tcPr>
+          <w:p>
+            <w:pPr>
+              <w:rPr>
+                <w:rFonts w:ascii="Aptos" w:eastAsia="Aptos" w:hAnsi="Aptos" w:cs="Aptos"/>
+              </w:rPr>
+            </w:pPr>
+            <w:r>
+              <w:rPr>
+                <w:rFonts w:ascii="Aptos" w:eastAsia="Aptos" w:hAnsi="Aptos" w:cs="Aptos"/>
               </w:rPr>
               <w:t>Scenariusz</w:t>
             </w:r>
@@ -170,36 +102,21 @@
         </w:tc>
         <w:tc>
           <w:tcPr>
-            <w:tcW w:w="6825" w:type="dxa"/>
-            <w:tcMar>
-              <w:left w:w="105" w:type="dxa"/>
-              <w:right w:w="105" w:type="dxa"/>
-            </w:tcMar>
-            <w:vAlign w:val="top"/>
-          </w:tcPr>
-          <w:p>
-            <w:pPr>
-              <w:rPr>
-                <w:rFonts w:ascii="Aptos" w:hAnsi="Aptos" w:eastAsia="Aptos" w:cs="Aptos"/>
-                <w:b w:val="0"/>
-                <w:bCs w:val="0"/>
-                <w:i w:val="0"/>
-                <w:iCs w:val="0"/>
-                <w:sz w:val="24"/>
-                <w:szCs w:val="24"/>
-                <w:lang w:val="pl-PL"/>
-              </w:rPr>
-            </w:pPr>
-            <w:r>
-              <w:rPr>
-                <w:rFonts w:ascii="Aptos" w:hAnsi="Aptos" w:eastAsia="Aptos" w:cs="Aptos"/>
-                <w:b w:val="0"/>
-                <w:bCs w:val="0"/>
-                <w:i w:val="0"/>
-                <w:iCs w:val="0"/>
-                <w:sz w:val="24"/>
-                <w:szCs w:val="24"/>
-                <w:lang w:val="pl-PL"/>
+            <w:tcW w:w="6821" w:type="dxa"/>
+            <w:tcMar>
+              <w:left w:w="105" w:type="dxa"/>
+              <w:right w:w="105" w:type="dxa"/>
+            </w:tcMar>
+          </w:tcPr>
+          <w:p>
+            <w:pPr>
+              <w:rPr>
+                <w:rFonts w:ascii="Aptos" w:eastAsia="Aptos" w:hAnsi="Aptos" w:cs="Aptos"/>
+              </w:rPr>
+            </w:pPr>
+            <w:r>
+              <w:rPr>
+                <w:rFonts w:ascii="Aptos" w:eastAsia="Aptos" w:hAnsi="Aptos" w:cs="Aptos"/>
               </w:rPr>
               <w:t>Wykładowca dodaje nowy materiał</w:t>
             </w:r>
@@ -212,75 +129,45 @@
         </w:trPr>
         <w:tc>
           <w:tcPr>
-            <w:tcW w:w="2190" w:type="dxa"/>
-            <w:tcMar>
-              <w:left w:w="105" w:type="dxa"/>
-              <w:right w:w="105" w:type="dxa"/>
-            </w:tcMar>
-            <w:vAlign w:val="top"/>
-          </w:tcPr>
-          <w:p>
-            <w:pPr>
-              <w:rPr>
-                <w:rFonts w:ascii="Aptos" w:hAnsi="Aptos" w:eastAsia="Aptos" w:cs="Aptos"/>
-                <w:b w:val="0"/>
-                <w:bCs w:val="0"/>
-                <w:i w:val="0"/>
-                <w:iCs w:val="0"/>
-                <w:sz w:val="24"/>
-                <w:szCs w:val="24"/>
-                <w:lang w:val="pl-PL"/>
-              </w:rPr>
-            </w:pPr>
-            <w:r>
-              <w:rPr>
-                <w:rFonts w:ascii="Aptos" w:hAnsi="Aptos" w:eastAsia="Aptos" w:cs="Aptos"/>
-                <w:b w:val="0"/>
-                <w:bCs w:val="0"/>
-                <w:i w:val="0"/>
-                <w:iCs w:val="0"/>
-                <w:sz w:val="24"/>
-                <w:szCs w:val="24"/>
-                <w:lang w:val="pl-PL"/>
-              </w:rPr>
-              <w:t>Warunki wstępne</w:t>
-            </w:r>
-          </w:p>
-        </w:tc>
-        <w:tc>
-          <w:tcPr>
-            <w:tcW w:w="6825" w:type="dxa"/>
-            <w:tcMar>
-              <w:left w:w="105" w:type="dxa"/>
-              <w:right w:w="105" w:type="dxa"/>
-            </w:tcMar>
-            <w:vAlign w:val="top"/>
-          </w:tcPr>
-          <w:p>
-            <w:pPr>
-              <w:rPr>
-                <w:rFonts w:ascii="Aptos" w:hAnsi="Aptos" w:eastAsia="Aptos" w:cs="Aptos"/>
-                <w:b w:val="0"/>
-                <w:bCs w:val="0"/>
-                <w:i w:val="0"/>
-                <w:iCs w:val="0"/>
-                <w:sz w:val="24"/>
-                <w:szCs w:val="24"/>
-                <w:lang w:val="pl-PL"/>
-              </w:rPr>
-            </w:pPr>
-            <w:r>
-              <w:rPr>
-                <w:rFonts w:ascii="Aptos" w:hAnsi="Aptos" w:eastAsia="Aptos" w:cs="Aptos"/>
-                <w:b w:val="0"/>
-                <w:bCs w:val="0"/>
-                <w:i w:val="0"/>
-                <w:iCs w:val="0"/>
-                <w:sz w:val="24"/>
-                <w:szCs w:val="24"/>
-                <w:lang w:val="pl-PL"/>
-              </w:rPr>
-              <w:t>Wykładowca jest zalogowany</w:t>
+            <w:tcW w:w="2189" w:type="dxa"/>
+            <w:tcMar>
+              <w:left w:w="105" w:type="dxa"/>
+              <w:right w:w="105" w:type="dxa"/>
+            </w:tcMar>
+          </w:tcPr>
+          <w:p>
+            <w:pPr>
+              <w:rPr>
+                <w:rFonts w:ascii="Aptos" w:eastAsia="Aptos" w:hAnsi="Aptos" w:cs="Aptos"/>
+              </w:rPr>
+            </w:pPr>
+            <w:r>
+              <w:rPr>
+                <w:rFonts w:ascii="Aptos" w:eastAsia="Aptos" w:hAnsi="Aptos" w:cs="Aptos"/>
+              </w:rPr>
+              <w:t>Aktorzy</w:t>
+            </w:r>
+          </w:p>
+        </w:tc>
+        <w:tc>
+          <w:tcPr>
+            <w:tcW w:w="6821" w:type="dxa"/>
+            <w:tcMar>
+              <w:left w:w="105" w:type="dxa"/>
+              <w:right w:w="105" w:type="dxa"/>
+            </w:tcMar>
+          </w:tcPr>
+          <w:p>
+            <w:pPr>
+              <w:rPr>
+                <w:rFonts w:ascii="Aptos" w:eastAsia="Aptos" w:hAnsi="Aptos" w:cs="Aptos"/>
+              </w:rPr>
+            </w:pPr>
+            <w:r>
+              <w:rPr>
+                <w:rFonts w:ascii="Aptos" w:eastAsia="Aptos" w:hAnsi="Aptos" w:cs="Aptos"/>
+              </w:rPr>
+              <w:t>Wykładowca</w:t>
             </w:r>
           </w:p>
         </w:tc>
@@ -291,75 +178,51 @@
         </w:trPr>
         <w:tc>
           <w:tcPr>
-            <w:tcW w:w="2190" w:type="dxa"/>
-            <w:tcMar>
-              <w:left w:w="105" w:type="dxa"/>
-              <w:right w:w="105" w:type="dxa"/>
-            </w:tcMar>
-            <w:vAlign w:val="top"/>
-          </w:tcPr>
-          <w:p>
-            <w:pPr>
-              <w:rPr>
-                <w:rFonts w:ascii="Aptos" w:hAnsi="Aptos" w:eastAsia="Aptos" w:cs="Aptos"/>
-                <w:b w:val="0"/>
-                <w:bCs w:val="0"/>
-                <w:i w:val="0"/>
-                <w:iCs w:val="0"/>
-                <w:sz w:val="24"/>
-                <w:szCs w:val="24"/>
-                <w:lang w:val="pl-PL"/>
-              </w:rPr>
-            </w:pPr>
-            <w:r>
-              <w:rPr>
-                <w:rFonts w:ascii="Aptos" w:hAnsi="Aptos" w:eastAsia="Aptos" w:cs="Aptos"/>
-                <w:b w:val="0"/>
-                <w:bCs w:val="0"/>
-                <w:i w:val="0"/>
-                <w:iCs w:val="0"/>
-                <w:sz w:val="24"/>
-                <w:szCs w:val="24"/>
-                <w:lang w:val="pl-PL"/>
-              </w:rPr>
-              <w:t>Niezmienniki</w:t>
-            </w:r>
-          </w:p>
-        </w:tc>
-        <w:tc>
-          <w:tcPr>
-            <w:tcW w:w="6825" w:type="dxa"/>
-            <w:tcMar>
-              <w:left w:w="105" w:type="dxa"/>
-              <w:right w:w="105" w:type="dxa"/>
-            </w:tcMar>
-            <w:vAlign w:val="top"/>
-          </w:tcPr>
-          <w:p>
-            <w:pPr>
-              <w:rPr>
-                <w:rFonts w:ascii="Aptos" w:hAnsi="Aptos" w:eastAsia="Aptos" w:cs="Aptos"/>
-                <w:b w:val="0"/>
-                <w:bCs w:val="0"/>
-                <w:i w:val="0"/>
-                <w:iCs w:val="0"/>
-                <w:sz w:val="24"/>
-                <w:szCs w:val="24"/>
-                <w:lang w:val="pl-PL"/>
-              </w:rPr>
-            </w:pPr>
-            <w:r>
-              <w:rPr>
-                <w:rFonts w:ascii="Aptos" w:hAnsi="Aptos" w:eastAsia="Aptos" w:cs="Aptos"/>
-                <w:b w:val="0"/>
-                <w:bCs w:val="0"/>
-                <w:i w:val="0"/>
-                <w:iCs w:val="0"/>
-                <w:sz w:val="24"/>
-                <w:szCs w:val="24"/>
-                <w:lang w:val="pl-PL"/>
-              </w:rPr>
-              <w:t>Wykładowca chce dodać materiał do jednego z folderów związanych z przedmiotami</w:t>
+            <w:tcW w:w="2189" w:type="dxa"/>
+            <w:tcMar>
+              <w:left w:w="105" w:type="dxa"/>
+              <w:right w:w="105" w:type="dxa"/>
+            </w:tcMar>
+          </w:tcPr>
+          <w:p>
+            <w:pPr>
+              <w:rPr>
+                <w:rFonts w:ascii="Aptos" w:eastAsia="Aptos" w:hAnsi="Aptos" w:cs="Aptos"/>
+              </w:rPr>
+            </w:pPr>
+            <w:r>
+              <w:rPr>
+                <w:rFonts w:ascii="Aptos" w:eastAsia="Aptos" w:hAnsi="Aptos" w:cs="Aptos"/>
+              </w:rPr>
+              <w:t>Warunki wstępne</w:t>
+            </w:r>
+          </w:p>
+        </w:tc>
+        <w:tc>
+          <w:tcPr>
+            <w:tcW w:w="6821" w:type="dxa"/>
+            <w:tcMar>
+              <w:left w:w="105" w:type="dxa"/>
+              <w:right w:w="105" w:type="dxa"/>
+            </w:tcMar>
+          </w:tcPr>
+          <w:p>
+            <w:pPr>
+              <w:rPr>
+                <w:rFonts w:ascii="Aptos" w:eastAsia="Aptos" w:hAnsi="Aptos" w:cs="Aptos"/>
+              </w:rPr>
+            </w:pPr>
+            <w:r>
+              <w:rPr>
+                <w:rFonts w:ascii="Aptos" w:eastAsia="Aptos" w:hAnsi="Aptos" w:cs="Aptos"/>
+              </w:rPr>
+              <w:t>Wykładowca jest zalogowany</w:t>
+            </w:r>
+            <w:r>
+              <w:rPr>
+                <w:rFonts w:ascii="Aptos" w:eastAsia="Aptos" w:hAnsi="Aptos" w:cs="Aptos"/>
+              </w:rPr>
+              <w:t xml:space="preserve"> do systemu. Wykładowca prowadzi wybrany przedmiot</w:t>
             </w:r>
           </w:p>
         </w:tc>
@@ -370,75 +233,63 @@
         </w:trPr>
         <w:tc>
           <w:tcPr>
-            <w:tcW w:w="2190" w:type="dxa"/>
-            <w:tcMar>
-              <w:left w:w="105" w:type="dxa"/>
-              <w:right w:w="105" w:type="dxa"/>
-            </w:tcMar>
-            <w:vAlign w:val="top"/>
-          </w:tcPr>
-          <w:p>
-            <w:pPr>
-              <w:rPr>
-                <w:rFonts w:ascii="Aptos" w:hAnsi="Aptos" w:eastAsia="Aptos" w:cs="Aptos"/>
-                <w:b w:val="0"/>
-                <w:bCs w:val="0"/>
-                <w:i w:val="0"/>
-                <w:iCs w:val="0"/>
-                <w:sz w:val="24"/>
-                <w:szCs w:val="24"/>
-                <w:lang w:val="pl-PL"/>
-              </w:rPr>
-            </w:pPr>
-            <w:r>
-              <w:rPr>
-                <w:rFonts w:ascii="Aptos" w:hAnsi="Aptos" w:eastAsia="Aptos" w:cs="Aptos"/>
-                <w:b w:val="0"/>
-                <w:bCs w:val="0"/>
-                <w:i w:val="0"/>
-                <w:iCs w:val="0"/>
-                <w:sz w:val="24"/>
-                <w:szCs w:val="24"/>
-                <w:lang w:val="pl-PL"/>
-              </w:rPr>
-              <w:t>Opis</w:t>
-            </w:r>
-          </w:p>
-        </w:tc>
-        <w:tc>
-          <w:tcPr>
-            <w:tcW w:w="6825" w:type="dxa"/>
-            <w:tcMar>
-              <w:left w:w="105" w:type="dxa"/>
-              <w:right w:w="105" w:type="dxa"/>
-            </w:tcMar>
-            <w:vAlign w:val="top"/>
-          </w:tcPr>
-          <w:p>
-            <w:pPr>
-              <w:rPr>
-                <w:rFonts w:ascii="Aptos" w:hAnsi="Aptos" w:eastAsia="Aptos" w:cs="Aptos"/>
-                <w:b w:val="0"/>
-                <w:bCs w:val="0"/>
-                <w:i w:val="0"/>
-                <w:iCs w:val="0"/>
-                <w:sz w:val="24"/>
-                <w:szCs w:val="24"/>
-                <w:lang w:val="pl-PL"/>
-              </w:rPr>
-            </w:pPr>
-            <w:r>
-              <w:rPr>
-                <w:rFonts w:ascii="Aptos" w:hAnsi="Aptos" w:eastAsia="Aptos" w:cs="Aptos"/>
-                <w:b w:val="0"/>
-                <w:bCs w:val="0"/>
-                <w:i w:val="0"/>
-                <w:iCs w:val="0"/>
-                <w:sz w:val="24"/>
-                <w:szCs w:val="24"/>
-                <w:lang w:val="pl-PL"/>
-              </w:rPr>
-              <w:t>Wykładowca wybiera folder, do którego chce dodać nowy materiał. Po wybraniu folderu wybrane przedmioty zostają do niego dodane.</w:t>
+            <w:tcW w:w="2189" w:type="dxa"/>
+            <w:tcMar>
+              <w:left w:w="105" w:type="dxa"/>
+              <w:right w:w="105" w:type="dxa"/>
+            </w:tcMar>
+          </w:tcPr>
+          <w:p>
+            <w:pPr>
+              <w:rPr>
+                <w:rFonts w:ascii="Aptos" w:eastAsia="Aptos" w:hAnsi="Aptos" w:cs="Aptos"/>
+              </w:rPr>
+            </w:pPr>
+            <w:r>
+              <w:rPr>
+                <w:rFonts w:ascii="Aptos" w:eastAsia="Aptos" w:hAnsi="Aptos" w:cs="Aptos"/>
+              </w:rPr>
+              <w:t>Niezmienniki</w:t>
+            </w:r>
+          </w:p>
+        </w:tc>
+        <w:tc>
+          <w:tcPr>
+            <w:tcW w:w="6821" w:type="dxa"/>
+            <w:tcMar>
+              <w:left w:w="105" w:type="dxa"/>
+              <w:right w:w="105" w:type="dxa"/>
+            </w:tcMar>
+          </w:tcPr>
+          <w:p>
+            <w:pPr>
+              <w:rPr>
+                <w:rFonts w:ascii="Aptos" w:eastAsia="Aptos" w:hAnsi="Aptos" w:cs="Aptos"/>
+              </w:rPr>
+            </w:pPr>
+            <w:r>
+              <w:rPr>
+                <w:rFonts w:ascii="Aptos" w:eastAsia="Aptos" w:hAnsi="Aptos" w:cs="Aptos"/>
+              </w:rPr>
+              <w:t xml:space="preserve">Wykładowca chce dodać materiał jednego </w:t>
+            </w:r>
+            <w:r>
+              <w:rPr>
+                <w:rFonts w:ascii="Aptos" w:eastAsia="Aptos" w:hAnsi="Aptos" w:cs="Aptos"/>
+              </w:rPr>
+              <w:t>do jednego z przedmiotów</w:t>
+            </w:r>
+            <w:r>
+              <w:rPr>
+                <w:rFonts w:ascii="Aptos" w:eastAsia="Aptos" w:hAnsi="Aptos" w:cs="Aptos"/>
+              </w:rPr>
+              <w:t>. Sesja wykładowcy pozostaje aktywna, stan bazy danych pozostaje spójny</w:t>
+            </w:r>
+            <w:r>
+              <w:rPr>
+                <w:rFonts w:ascii="Aptos" w:eastAsia="Aptos" w:hAnsi="Aptos" w:cs="Aptos"/>
+              </w:rPr>
+              <w:t xml:space="preserve"> przez cały czas trawnia operacji</w:t>
             </w:r>
           </w:p>
         </w:tc>
@@ -449,36 +300,88 @@
         </w:trPr>
         <w:tc>
           <w:tcPr>
-            <w:tcW w:w="2190" w:type="dxa"/>
-            <w:tcMar>
-              <w:left w:w="105" w:type="dxa"/>
-              <w:right w:w="105" w:type="dxa"/>
-            </w:tcMar>
-            <w:vAlign w:val="top"/>
-          </w:tcPr>
-          <w:p>
-            <w:pPr>
-              <w:rPr>
-                <w:rFonts w:ascii="Aptos" w:hAnsi="Aptos" w:eastAsia="Aptos" w:cs="Aptos"/>
-                <w:b w:val="0"/>
-                <w:bCs w:val="0"/>
-                <w:i w:val="0"/>
-                <w:iCs w:val="0"/>
-                <w:sz w:val="24"/>
-                <w:szCs w:val="24"/>
-                <w:lang w:val="pl-PL"/>
-              </w:rPr>
-            </w:pPr>
-            <w:r>
-              <w:rPr>
-                <w:rFonts w:ascii="Aptos" w:hAnsi="Aptos" w:eastAsia="Aptos" w:cs="Aptos"/>
-                <w:b w:val="0"/>
-                <w:bCs w:val="0"/>
-                <w:i w:val="0"/>
-                <w:iCs w:val="0"/>
-                <w:sz w:val="24"/>
-                <w:szCs w:val="24"/>
-                <w:lang w:val="pl-PL"/>
+            <w:tcW w:w="2189" w:type="dxa"/>
+            <w:tcMar>
+              <w:left w:w="105" w:type="dxa"/>
+              <w:right w:w="105" w:type="dxa"/>
+            </w:tcMar>
+          </w:tcPr>
+          <w:p>
+            <w:pPr>
+              <w:rPr>
+                <w:rFonts w:ascii="Aptos" w:eastAsia="Aptos" w:hAnsi="Aptos" w:cs="Aptos"/>
+              </w:rPr>
+            </w:pPr>
+            <w:r>
+              <w:rPr>
+                <w:rFonts w:ascii="Aptos" w:eastAsia="Aptos" w:hAnsi="Aptos" w:cs="Aptos"/>
+              </w:rPr>
+              <w:t>Opis</w:t>
+            </w:r>
+          </w:p>
+        </w:tc>
+        <w:tc>
+          <w:tcPr>
+            <w:tcW w:w="6821" w:type="dxa"/>
+            <w:tcMar>
+              <w:left w:w="105" w:type="dxa"/>
+              <w:right w:w="105" w:type="dxa"/>
+            </w:tcMar>
+          </w:tcPr>
+          <w:p>
+            <w:pPr>
+              <w:rPr>
+                <w:rFonts w:ascii="Aptos" w:eastAsia="Aptos" w:hAnsi="Aptos" w:cs="Aptos"/>
+              </w:rPr>
+            </w:pPr>
+            <w:r>
+              <w:rPr>
+                <w:rFonts w:ascii="Aptos" w:eastAsia="Aptos" w:hAnsi="Aptos" w:cs="Aptos"/>
+              </w:rPr>
+              <w:t xml:space="preserve">Wykładowca wybiera </w:t>
+            </w:r>
+            <w:r>
+              <w:rPr>
+                <w:rFonts w:ascii="Aptos" w:eastAsia="Aptos" w:hAnsi="Aptos" w:cs="Aptos"/>
+              </w:rPr>
+              <w:t>przedmiot z listy przedmiotów, które prowadzi. Wykładowca przesyła tytuł i załącznik i zatwierdza wybór</w:t>
+            </w:r>
+            <w:r>
+              <w:rPr>
+                <w:rFonts w:ascii="Aptos" w:eastAsia="Aptos" w:hAnsi="Aptos" w:cs="Aptos"/>
+              </w:rPr>
+              <w:t xml:space="preserve">. </w:t>
+            </w:r>
+            <w:r>
+              <w:rPr>
+                <w:rFonts w:ascii="Aptos" w:eastAsia="Aptos" w:hAnsi="Aptos" w:cs="Aptos"/>
+              </w:rPr>
+              <w:t>System weryfikuje dane i zapisuje materiał w bazie danych. System wyświetla komunikat o sukcesie</w:t>
+            </w:r>
+          </w:p>
+        </w:tc>
+      </w:tr>
+      <w:tr>
+        <w:trPr>
+          <w:trHeight w:val="300"/>
+        </w:trPr>
+        <w:tc>
+          <w:tcPr>
+            <w:tcW w:w="2189" w:type="dxa"/>
+            <w:tcMar>
+              <w:left w:w="105" w:type="dxa"/>
+              <w:right w:w="105" w:type="dxa"/>
+            </w:tcMar>
+          </w:tcPr>
+          <w:p>
+            <w:pPr>
+              <w:rPr>
+                <w:rFonts w:ascii="Aptos" w:eastAsia="Aptos" w:hAnsi="Aptos" w:cs="Aptos"/>
+              </w:rPr>
+            </w:pPr>
+            <w:r>
+              <w:rPr>
+                <w:rFonts w:ascii="Aptos" w:eastAsia="Aptos" w:hAnsi="Aptos" w:cs="Aptos"/>
               </w:rPr>
               <w:t>Warunki końcowe</w:t>
             </w:r>
@@ -486,46 +389,49 @@
         </w:tc>
         <w:tc>
           <w:tcPr>
-            <w:tcW w:w="6825" w:type="dxa"/>
-            <w:tcMar>
-              <w:left w:w="105" w:type="dxa"/>
-              <w:right w:w="105" w:type="dxa"/>
-            </w:tcMar>
-            <w:vAlign w:val="top"/>
-          </w:tcPr>
-          <w:p>
-            <w:pPr>
-              <w:rPr>
-                <w:rFonts w:ascii="Aptos" w:hAnsi="Aptos" w:eastAsia="Aptos" w:cs="Aptos"/>
-                <w:b w:val="0"/>
-                <w:bCs w:val="0"/>
-                <w:i w:val="0"/>
-                <w:iCs w:val="0"/>
-                <w:sz w:val="24"/>
-                <w:szCs w:val="24"/>
-                <w:lang w:val="pl-PL"/>
-              </w:rPr>
-            </w:pPr>
-            <w:r>
-              <w:rPr>
-                <w:rFonts w:ascii="Aptos" w:hAnsi="Aptos" w:eastAsia="Aptos" w:cs="Aptos"/>
-                <w:b w:val="0"/>
-                <w:bCs w:val="0"/>
-                <w:i w:val="0"/>
-                <w:iCs w:val="0"/>
-                <w:sz w:val="24"/>
-                <w:szCs w:val="24"/>
-                <w:lang w:val="pl-PL"/>
-              </w:rPr>
-              <w:t>Nowy materiał został dodany do bazy danych.</w:t>
+            <w:tcW w:w="6821" w:type="dxa"/>
+            <w:tcMar>
+              <w:left w:w="105" w:type="dxa"/>
+              <w:right w:w="105" w:type="dxa"/>
+            </w:tcMar>
+          </w:tcPr>
+          <w:p>
+            <w:pPr>
+              <w:rPr>
+                <w:rFonts w:ascii="Aptos" w:eastAsia="Aptos" w:hAnsi="Aptos" w:cs="Aptos"/>
+              </w:rPr>
+            </w:pPr>
+            <w:r>
+              <w:rPr>
+                <w:rFonts w:ascii="Aptos" w:eastAsia="Aptos" w:hAnsi="Aptos" w:cs="Aptos"/>
+              </w:rPr>
+              <w:t>Nowy materiał został dodany do bazy danych</w:t>
+            </w:r>
+            <w:r>
+              <w:rPr>
+                <w:rFonts w:ascii="Aptos" w:eastAsia="Aptos" w:hAnsi="Aptos" w:cs="Aptos"/>
+              </w:rPr>
+              <w:t xml:space="preserve"> i przypisany do </w:t>
+            </w:r>
+            <w:r>
+              <w:rPr>
+                <w:rFonts w:ascii="Aptos" w:eastAsia="Aptos" w:hAnsi="Aptos" w:cs="Aptos"/>
+              </w:rPr>
+              <w:t>wybranego</w:t>
+            </w:r>
+            <w:r>
+              <w:rPr>
+                <w:rFonts w:ascii="Aptos" w:eastAsia="Aptos" w:hAnsi="Aptos" w:cs="Aptos"/>
+              </w:rPr>
+              <w:t xml:space="preserve"> przedmiotu</w:t>
             </w:r>
           </w:p>
         </w:tc>
       </w:tr>
     </w:tbl>
-    <w:p xmlns:wp14="http://schemas.microsoft.com/office/word/2010/wordml" wp14:paraId="57375426" wp14:textId="62C101ED"/>
+    <w:p/>
     <w:sectPr>
-      <w:pgSz w:w="11906" w:h="16838" w:orient="portrait"/>
+      <w:pgSz w:w="11906" w:h="16838"/>
       <w:pgMar w:top="1440" w:right="1440" w:bottom="1440" w:left="1440" w:header="708" w:footer="708" w:gutter="0"/>
       <w:cols w:space="708"/>
       <w:docGrid w:linePitch="360"/>
@@ -535,11 +441,11 @@
 </file>
 
 <file path=word/styles.xml><?xml version="1.0" encoding="utf-8"?>
-<w:styles xmlns:wp14="http://schemas.microsoft.com/office/word/2010/wordprocessingDrawing" xmlns:mc="http://schemas.openxmlformats.org/markup-compatibility/2006" xmlns:r="http://schemas.openxmlformats.org/officeDocument/2006/relationships" xmlns:w="http://schemas.openxmlformats.org/wordprocessingml/2006/main" xmlns:w14="http://schemas.microsoft.com/office/word/2010/wordml" xmlns:w15="http://schemas.microsoft.com/office/word/2012/wordml" xmlns:w16se="http://schemas.microsoft.com/office/word/2015/wordml/symex" xmlns:w16cid="http://schemas.microsoft.com/office/word/2016/wordml/cid" xmlns:w16="http://schemas.microsoft.com/office/word/2018/wordml" xmlns:w16cex="http://schemas.microsoft.com/office/word/2018/wordml/cex" xmlns:w16sdtdh="http://schemas.microsoft.com/office/word/2020/wordml/sdtdatahash" xmlns:w16sdtfl="http://schemas.microsoft.com/office/word/2024/wordml/sdtformatlock" mc:Ignorable="w14 w15 wp14 w16se w16cid w16 w16cex w16sdtdh w16sdtfl">
+<w:styles xmlns:mc="http://schemas.openxmlformats.org/markup-compatibility/2006" xmlns:r="http://schemas.openxmlformats.org/officeDocument/2006/relationships" xmlns:w="http://schemas.openxmlformats.org/wordprocessingml/2006/main" xmlns:w14="http://schemas.microsoft.com/office/word/2010/wordml" xmlns:w15="http://schemas.microsoft.com/office/word/2012/wordml" xmlns:w16cex="http://schemas.microsoft.com/office/word/2018/wordml/cex" xmlns:w16cid="http://schemas.microsoft.com/office/word/2016/wordml/cid" xmlns:w16="http://schemas.microsoft.com/office/word/2018/wordml" xmlns:w16du="http://schemas.microsoft.com/office/word/2023/wordml/word16du" xmlns:w16sdtdh="http://schemas.microsoft.com/office/word/2020/wordml/sdtdatahash" xmlns:w16sdtfl="http://schemas.microsoft.com/office/word/2024/wordml/sdtformatlock" xmlns:w16se="http://schemas.microsoft.com/office/word/2015/wordml/symex" mc:Ignorable="w14 w15 w16se w16cid w16 w16cex w16sdtdh w16sdtfl w16du">
   <w:docDefaults>
     <w:rPrDefault>
       <w:rPr>
-        <w:rFonts w:asciiTheme="minorHAnsi" w:hAnsiTheme="minorHAnsi" w:eastAsiaTheme="minorHAnsi" w:cstheme="minorBidi"/>
+        <w:rFonts w:asciiTheme="minorHAnsi" w:eastAsiaTheme="minorHAnsi" w:hAnsiTheme="minorHAnsi" w:cstheme="minorBidi"/>
         <w:sz w:val="24"/>
         <w:szCs w:val="24"/>
         <w:lang w:val="pl-PL" w:eastAsia="en-US" w:bidi="ar-SA"/>
@@ -551,17 +457,17 @@
       </w:pPr>
     </w:pPrDefault>
   </w:docDefaults>
-  <w:latentStyles w:defLockedState="0" w:defUIPriority="99" w:defSemiHidden="0" w:defUnhideWhenUsed="0" w:defQFormat="0" w:count="371">
+  <w:latentStyles w:defLockedState="0" w:defUIPriority="99" w:defSemiHidden="0" w:defUnhideWhenUsed="0" w:defQFormat="0" w:count="376">
     <w:lsdException w:name="Normal" w:uiPriority="0" w:qFormat="1"/>
     <w:lsdException w:name="heading 1" w:uiPriority="9" w:qFormat="1"/>
-    <w:lsdException w:name="heading 2" w:uiPriority="9" w:semiHidden="1" w:unhideWhenUsed="1" w:qFormat="1"/>
-    <w:lsdException w:name="heading 3" w:uiPriority="9" w:semiHidden="1" w:unhideWhenUsed="1" w:qFormat="1"/>
-    <w:lsdException w:name="heading 4" w:uiPriority="9" w:semiHidden="1" w:unhideWhenUsed="1" w:qFormat="1"/>
-    <w:lsdException w:name="heading 5" w:uiPriority="9" w:semiHidden="1" w:unhideWhenUsed="1" w:qFormat="1"/>
-    <w:lsdException w:name="heading 6" w:uiPriority="9" w:semiHidden="1" w:unhideWhenUsed="1" w:qFormat="1"/>
-    <w:lsdException w:name="heading 7" w:uiPriority="9" w:semiHidden="1" w:unhideWhenUsed="1" w:qFormat="1"/>
-    <w:lsdException w:name="heading 8" w:uiPriority="9" w:semiHidden="1" w:unhideWhenUsed="1" w:qFormat="1"/>
-    <w:lsdException w:name="heading 9" w:uiPriority="9" w:semiHidden="1" w:unhideWhenUsed="1" w:qFormat="1"/>
+    <w:lsdException w:name="heading 2" w:semiHidden="1" w:uiPriority="9" w:unhideWhenUsed="1" w:qFormat="1"/>
+    <w:lsdException w:name="heading 3" w:semiHidden="1" w:uiPriority="9" w:unhideWhenUsed="1" w:qFormat="1"/>
+    <w:lsdException w:name="heading 4" w:semiHidden="1" w:uiPriority="9" w:unhideWhenUsed="1" w:qFormat="1"/>
+    <w:lsdException w:name="heading 5" w:semiHidden="1" w:uiPriority="9" w:unhideWhenUsed="1" w:qFormat="1"/>
+    <w:lsdException w:name="heading 6" w:semiHidden="1" w:uiPriority="9" w:unhideWhenUsed="1" w:qFormat="1"/>
+    <w:lsdException w:name="heading 7" w:semiHidden="1" w:uiPriority="9" w:unhideWhenUsed="1" w:qFormat="1"/>
+    <w:lsdException w:name="heading 8" w:semiHidden="1" w:uiPriority="9" w:unhideWhenUsed="1" w:qFormat="1"/>
+    <w:lsdException w:name="heading 9" w:semiHidden="1" w:uiPriority="9" w:unhideWhenUsed="1" w:qFormat="1"/>
     <w:lsdException w:name="index 1" w:semiHidden="1" w:unhideWhenUsed="1"/>
     <w:lsdException w:name="index 2" w:semiHidden="1" w:unhideWhenUsed="1"/>
     <w:lsdException w:name="index 3" w:semiHidden="1" w:unhideWhenUsed="1"/>
@@ -571,22 +477,22 @@
     <w:lsdException w:name="index 7" w:semiHidden="1" w:unhideWhenUsed="1"/>
     <w:lsdException w:name="index 8" w:semiHidden="1" w:unhideWhenUsed="1"/>
     <w:lsdException w:name="index 9" w:semiHidden="1" w:unhideWhenUsed="1"/>
-    <w:lsdException w:name="toc 1" w:uiPriority="39" w:semiHidden="1" w:unhideWhenUsed="1"/>
-    <w:lsdException w:name="toc 2" w:uiPriority="39" w:semiHidden="1" w:unhideWhenUsed="1"/>
-    <w:lsdException w:name="toc 3" w:uiPriority="39" w:semiHidden="1" w:unhideWhenUsed="1"/>
-    <w:lsdException w:name="toc 4" w:uiPriority="39" w:semiHidden="1" w:unhideWhenUsed="1"/>
-    <w:lsdException w:name="toc 5" w:uiPriority="39" w:semiHidden="1" w:unhideWhenUsed="1"/>
-    <w:lsdException w:name="toc 6" w:uiPriority="39" w:semiHidden="1" w:unhideWhenUsed="1"/>
-    <w:lsdException w:name="toc 7" w:uiPriority="39" w:semiHidden="1" w:unhideWhenUsed="1"/>
-    <w:lsdException w:name="toc 8" w:uiPriority="39" w:semiHidden="1" w:unhideWhenUsed="1"/>
-    <w:lsdException w:name="toc 9" w:uiPriority="39" w:semiHidden="1" w:unhideWhenUsed="1"/>
+    <w:lsdException w:name="toc 1" w:semiHidden="1" w:uiPriority="39" w:unhideWhenUsed="1"/>
+    <w:lsdException w:name="toc 2" w:semiHidden="1" w:uiPriority="39" w:unhideWhenUsed="1"/>
+    <w:lsdException w:name="toc 3" w:semiHidden="1" w:uiPriority="39" w:unhideWhenUsed="1"/>
+    <w:lsdException w:name="toc 4" w:semiHidden="1" w:uiPriority="39" w:unhideWhenUsed="1"/>
+    <w:lsdException w:name="toc 5" w:semiHidden="1" w:uiPriority="39" w:unhideWhenUsed="1"/>
+    <w:lsdException w:name="toc 6" w:semiHidden="1" w:uiPriority="39" w:unhideWhenUsed="1"/>
+    <w:lsdException w:name="toc 7" w:semiHidden="1" w:uiPriority="39" w:unhideWhenUsed="1"/>
+    <w:lsdException w:name="toc 8" w:semiHidden="1" w:uiPriority="39" w:unhideWhenUsed="1"/>
+    <w:lsdException w:name="toc 9" w:semiHidden="1" w:uiPriority="39" w:unhideWhenUsed="1"/>
     <w:lsdException w:name="Normal Indent" w:semiHidden="1" w:unhideWhenUsed="1"/>
     <w:lsdException w:name="footnote text" w:semiHidden="1" w:unhideWhenUsed="1"/>
     <w:lsdException w:name="annotation text" w:semiHidden="1" w:unhideWhenUsed="1"/>
     <w:lsdException w:name="header" w:semiHidden="1" w:unhideWhenUsed="1"/>
     <w:lsdException w:name="footer" w:semiHidden="1" w:unhideWhenUsed="1"/>
     <w:lsdException w:name="index heading" w:semiHidden="1" w:unhideWhenUsed="1"/>
-    <w:lsdException w:name="caption" w:uiPriority="35" w:semiHidden="1" w:unhideWhenUsed="1" w:qFormat="1"/>
+    <w:lsdException w:name="caption" w:semiHidden="1" w:uiPriority="35" w:unhideWhenUsed="1" w:qFormat="1"/>
     <w:lsdException w:name="table of figures" w:semiHidden="1" w:unhideWhenUsed="1"/>
     <w:lsdException w:name="envelope address" w:semiHidden="1" w:unhideWhenUsed="1"/>
     <w:lsdException w:name="envelope return" w:semiHidden="1" w:unhideWhenUsed="1"/>
@@ -617,7 +523,7 @@
     <w:lsdException w:name="Title" w:uiPriority="10" w:qFormat="1"/>
     <w:lsdException w:name="Closing" w:semiHidden="1" w:unhideWhenUsed="1"/>
     <w:lsdException w:name="Signature" w:semiHidden="1" w:unhideWhenUsed="1"/>
-    <w:lsdException w:name="Default Paragraph Font" w:uiPriority="1" w:semiHidden="1" w:unhideWhenUsed="1"/>
+    <w:lsdException w:name="Default Paragraph Font" w:semiHidden="1" w:uiPriority="1" w:unhideWhenUsed="1"/>
     <w:lsdException w:name="Body Text" w:semiHidden="1" w:unhideWhenUsed="1"/>
     <w:lsdException w:name="Body Text Indent" w:semiHidden="1" w:unhideWhenUsed="1"/>
     <w:lsdException w:name="List Continue" w:semiHidden="1" w:unhideWhenUsed="1"/>
@@ -817,8 +723,8 @@
     <w:lsdException w:name="Subtle Reference" w:uiPriority="31" w:qFormat="1"/>
     <w:lsdException w:name="Intense Reference" w:uiPriority="32" w:qFormat="1"/>
     <w:lsdException w:name="Book Title" w:uiPriority="33" w:qFormat="1"/>
-    <w:lsdException w:name="Bibliography" w:uiPriority="37" w:semiHidden="1" w:unhideWhenUsed="1"/>
-    <w:lsdException w:name="TOC Heading" w:uiPriority="39" w:semiHidden="1" w:unhideWhenUsed="1" w:qFormat="1"/>
+    <w:lsdException w:name="Bibliography" w:semiHidden="1" w:uiPriority="37" w:unhideWhenUsed="1"/>
+    <w:lsdException w:name="TOC Heading" w:semiHidden="1" w:uiPriority="39" w:unhideWhenUsed="1" w:qFormat="1"/>
     <w:lsdException w:name="Plain Table 1" w:uiPriority="41"/>
     <w:lsdException w:name="Plain Table 2" w:uiPriority="42"/>
     <w:lsdException w:name="Plain Table 3" w:uiPriority="43"/>
@@ -923,18 +829,23 @@
     <w:lsdException w:name="List Table 5 Dark Accent 6" w:uiPriority="50"/>
     <w:lsdException w:name="List Table 6 Colorful Accent 6" w:uiPriority="51"/>
     <w:lsdException w:name="List Table 7 Colorful Accent 6" w:uiPriority="52"/>
+    <w:lsdException w:name="Mention" w:semiHidden="1" w:unhideWhenUsed="1"/>
+    <w:lsdException w:name="Smart Hyperlink" w:semiHidden="1" w:unhideWhenUsed="1"/>
+    <w:lsdException w:name="Hashtag" w:semiHidden="1" w:unhideWhenUsed="1"/>
+    <w:lsdException w:name="Unresolved Mention" w:semiHidden="1" w:unhideWhenUsed="1"/>
+    <w:lsdException w:name="Smart Link" w:semiHidden="1" w:unhideWhenUsed="1"/>
   </w:latentStyles>
-  <w:style w:type="paragraph" w:styleId="Normal" w:default="1">
+  <w:style w:type="paragraph" w:default="1" w:styleId="a">
     <w:name w:val="Normal"/>
     <w:qFormat/>
   </w:style>
-  <w:style w:type="character" w:styleId="DefaultParagraphFont" w:default="1">
+  <w:style w:type="character" w:default="1" w:styleId="a0">
     <w:name w:val="Default Paragraph Font"/>
     <w:uiPriority w:val="1"/>
     <w:semiHidden/>
     <w:unhideWhenUsed/>
   </w:style>
-  <w:style w:type="table" w:styleId="TableNormal" w:default="1">
+  <w:style w:type="table" w:default="1" w:styleId="a1">
     <w:name w:val="Normal Table"/>
     <w:uiPriority w:val="99"/>
     <w:semiHidden/>
@@ -949,43 +860,36 @@
       </w:tblCellMar>
     </w:tblPr>
   </w:style>
-  <w:style w:type="numbering" w:styleId="NoList" w:default="1">
+  <w:style w:type="numbering" w:default="1" w:styleId="a2">
     <w:name w:val="No List"/>
     <w:uiPriority w:val="99"/>
     <w:semiHidden/>
     <w:unhideWhenUsed/>
   </w:style>
-  <w:style xmlns:w="http://schemas.openxmlformats.org/wordprocessingml/2006/main" w:type="table" w:styleId="TableGrid">
-    <w:name xmlns:w="http://schemas.openxmlformats.org/wordprocessingml/2006/main" w:val="Table Grid"/>
-    <w:basedOn xmlns:w="http://schemas.openxmlformats.org/wordprocessingml/2006/main" w:val="TableNormal"/>
-    <w:uiPriority xmlns:w="http://schemas.openxmlformats.org/wordprocessingml/2006/main" w:val="59"/>
-    <w:rsid xmlns:w="http://schemas.openxmlformats.org/wordprocessingml/2006/main" w:val="00FB4123"/>
-    <w:pPr xmlns:w="http://schemas.openxmlformats.org/wordprocessingml/2006/main">
+  <w:style w:type="table" w:styleId="a3">
+    <w:name w:val="Table Grid"/>
+    <w:basedOn w:val="a1"/>
+    <w:uiPriority w:val="59"/>
+    <w:rsid w:val="00FB4123"/>
+    <w:pPr>
       <w:spacing w:after="0" w:line="240" w:lineRule="auto"/>
     </w:pPr>
-    <w:tblPr xmlns:w="http://schemas.openxmlformats.org/wordprocessingml/2006/main">
-      <w:tblInd w:w="0" w:type="dxa"/>
+    <w:tblPr>
       <w:tblBorders>
-        <w:top w:val="single" w:color="000000" w:themeColor="text1" w:sz="4" w:space="0"/>
-        <w:left w:val="single" w:color="000000" w:themeColor="text1" w:sz="4" w:space="0"/>
-        <w:bottom w:val="single" w:color="000000" w:themeColor="text1" w:sz="4" w:space="0"/>
-        <w:right w:val="single" w:color="000000" w:themeColor="text1" w:sz="4" w:space="0"/>
-        <w:insideH w:val="single" w:color="000000" w:themeColor="text1" w:sz="4" w:space="0"/>
-        <w:insideV w:val="single" w:color="000000" w:themeColor="text1" w:sz="4" w:space="0"/>
+        <w:top w:val="single" w:sz="4" w:space="0" w:color="000000" w:themeColor="text1"/>
+        <w:left w:val="single" w:sz="4" w:space="0" w:color="000000" w:themeColor="text1"/>
+        <w:bottom w:val="single" w:sz="4" w:space="0" w:color="000000" w:themeColor="text1"/>
+        <w:right w:val="single" w:sz="4" w:space="0" w:color="000000" w:themeColor="text1"/>
+        <w:insideH w:val="single" w:sz="4" w:space="0" w:color="000000" w:themeColor="text1"/>
+        <w:insideV w:val="single" w:sz="4" w:space="0" w:color="000000" w:themeColor="text1"/>
       </w:tblBorders>
-      <w:tblCellMar>
-        <w:top w:w="0" w:type="dxa"/>
-        <w:left w:w="108" w:type="dxa"/>
-        <w:bottom w:w="0" w:type="dxa"/>
-        <w:right w:w="108" w:type="dxa"/>
-      </w:tblCellMar>
     </w:tblPr>
   </w:style>
 </w:styles>
 </file>
 
 <file path=word/theme/theme1.xml><?xml version="1.0" encoding="utf-8"?>
-<a:theme xmlns:thm15="http://schemas.microsoft.com/office/thememl/2012/main" xmlns:a="http://schemas.openxmlformats.org/drawingml/2006/main" name="Office Theme">
+<a:theme xmlns:a="http://schemas.openxmlformats.org/drawingml/2006/main" name="Office Theme">
   <a:themeElements>
     <a:clrScheme name="Office">
       <a:dk1>

</xml_diff>